<commit_message>
finalize audited thesis submission package
</commit_message>
<xml_diff>
--- a/chapters/chapter2_methodology.docx
+++ b/chapters/chapter2_methodology.docx
@@ -132,7 +132,7 @@
           <w:i w:val="0"/>
           <w:sz w:val="24"/>
         </w:rPr>
-        <w:t>The research follows a deductive approach, applying established quality assessment frameworks—the DISCERN instrument and JAMA benchmarks—to evaluate content across a novel four-platform comparison. While these instruments were originally developed for traditional health information materials, their application to social media content represents a theoretically grounded extension that has been validated in prior research examining YouTube (Azer, 2020), TikTok (Kong et al., 2021), and Instagram health content (Chea &amp; Lim, 2023).</w:t>
+        <w:t>The research follows a deductive approach, applying established quality assessment frameworksâ€”the DISCERN instrument and JAMA benchmarksâ€”to evaluate content across a novel four-platform comparison. While these instruments were originally developed for traditional health information materials, their application to social media content represents a theoretically grounded extension that has been validated in prior research examining YouTube (Azer, 2020), TikTok (Kong et al., 2021), and Instagram health content (Chea &amp; Lim, 2023).</w:t>
       </w:r>
     </w:p>
     <w:p>
@@ -159,24 +159,7 @@
         <w:jc w:val="both"/>
       </w:pPr>
       <w:r>
-        <w:rPr>
-          <w:rFonts w:ascii="Times New Roman" w:hAnsi="Times New Roman" w:cs="Times New Roman"/>
-          <w:rFonts w:ascii="Times New Roman" w:hAnsi="Times New Roman"/>
-          <w:b/>
-          <w:i w:val="0"/>
-          <w:sz w:val="24"/>
-        </w:rPr>
-        <w:t xml:space="preserve">• Sample: </w:t>
-      </w:r>
-      <w:r>
-        <w:rPr>
-          <w:rFonts w:ascii="Times New Roman" w:hAnsi="Times New Roman" w:cs="Times New Roman"/>
-          <w:rFonts w:ascii="Times New Roman" w:hAnsi="Times New Roman"/>
-          <w:b w:val="0"/>
-          <w:i w:val="0"/>
-          <w:sz w:val="24"/>
-        </w:rPr>
-        <w:t>200 content items across four platforms (50 per platform).</w:t>
+        <w:t>â€¢ Sample: 197 content items across four platforms (50 websites, 50 YouTube videos, 47 TikTok videos, and 50 Instagram posts).</w:t>
       </w:r>
     </w:p>
     <w:p>
@@ -193,7 +176,7 @@
           <w:i w:val="0"/>
           <w:sz w:val="24"/>
         </w:rPr>
-        <w:t xml:space="preserve">• Phenomenon of Interest: </w:t>
+        <w:t xml:space="preserve">â€¢ Phenomenon of Interest: </w:t>
       </w:r>
       <w:r>
         <w:rPr>
@@ -220,7 +203,7 @@
           <w:i w:val="0"/>
           <w:sz w:val="24"/>
         </w:rPr>
-        <w:t xml:space="preserve">• Design: </w:t>
+        <w:t xml:space="preserve">â€¢ Design: </w:t>
       </w:r>
       <w:r>
         <w:rPr>
@@ -247,7 +230,7 @@
           <w:i w:val="0"/>
           <w:sz w:val="24"/>
         </w:rPr>
-        <w:t xml:space="preserve">• Evaluation: </w:t>
+        <w:t xml:space="preserve">â€¢ Evaluation: </w:t>
       </w:r>
       <w:r>
         <w:rPr>
@@ -274,7 +257,7 @@
           <w:i w:val="0"/>
           <w:sz w:val="24"/>
         </w:rPr>
-        <w:t xml:space="preserve">• Research type: </w:t>
+        <w:t xml:space="preserve">â€¢ Research type: </w:t>
       </w:r>
       <w:r>
         <w:rPr>
@@ -384,7 +367,7 @@
           <w:i w:val="0"/>
           <w:sz w:val="24"/>
         </w:rPr>
-        <w:t>The study sample comprises a total of N = 200 content items collected from four digital platforms: traditional websites accessed through Google search (n = 50), YouTube (n = 50), TikTok (n = 50), and Instagram (n = 50). This sample size was determined based on precedent in health information quality research, where samples of 40–60 items per platform have been established as sufficient for detecting meaningful quality differences (Leong et al., 2021; Drozd et al., 2018).</w:t>
+        <w:t>The study sample comprises a total of N = 197 content items collected from four digital platforms: traditional websites accessed through Google search (n = 50), YouTube (n = 50), TikTok (n = 47), and Instagram (n = 50). This sample size was determined based on precedent in health information quality research, where samples of 40â€“60 items per platform have been established as sufficient for detecting meaningful quality differences (Leong et al., 2021; Drozd et al., 2018).</w:t>
       </w:r>
     </w:p>
     <w:p>
@@ -418,7 +401,7 @@
           <w:i w:val="0"/>
           <w:sz w:val="24"/>
         </w:rPr>
-        <w:t>• “How to start exercising”</w:t>
+        <w:t>â€¢ â€œHow to start exercisingâ€</w:t>
       </w:r>
     </w:p>
     <w:p>
@@ -435,7 +418,7 @@
           <w:i w:val="0"/>
           <w:sz w:val="24"/>
         </w:rPr>
-        <w:t>• “Best exercises to lose weight”</w:t>
+        <w:t>â€¢ â€œBest exercises to lose weightâ€</w:t>
       </w:r>
     </w:p>
     <w:p>
@@ -452,7 +435,7 @@
           <w:i w:val="0"/>
           <w:sz w:val="24"/>
         </w:rPr>
-        <w:t>• “Strength training for beginners”</w:t>
+        <w:t>â€¢ â€œStrength training for beginnersâ€</w:t>
       </w:r>
     </w:p>
     <w:p>
@@ -469,7 +452,7 @@
           <w:i w:val="0"/>
           <w:sz w:val="24"/>
         </w:rPr>
-        <w:t>• “Physical activity guidelines”</w:t>
+        <w:t>â€¢ â€œPhysical activity guidelinesâ€</w:t>
       </w:r>
     </w:p>
     <w:p>
@@ -486,7 +469,7 @@
           <w:i w:val="0"/>
           <w:sz w:val="24"/>
         </w:rPr>
-        <w:t>• “Home workout routine”</w:t>
+        <w:t>â€¢ â€œHome workout routineâ€</w:t>
       </w:r>
     </w:p>
     <w:p>
@@ -503,7 +486,7 @@
           <w:i w:val="0"/>
           <w:sz w:val="24"/>
         </w:rPr>
-        <w:t>These search terms were selected to represent a range of common physical activity information-seeking behaviours, from general exercise initiation to specific activity modalities. For each search term, the first 10 results were collected from each platform, yielding 10 results × 5 search terms × 4 platforms = 200 content items. The sampling strategy employed convenience sampling of top-ranked search results, which simulates the actual information-seeking behaviour of typical users who predominantly access the first page of search results (Pan et al., 2007).</w:t>
+        <w:t>These search terms were selected to represent a range of common physical activity information-seeking behaviours, from general exercise initiation to specific activity modalities. For each search term, the first 10 results were collected from each platform, yielding 10 results Ã— 5 search terms Ã— 4 platforms = 200 content items. The sampling strategy employed convenience sampling of top-ranked search results, which simulates the actual information-seeking behaviour of typical users who predominantly access the first page of search results (Pan et al., 2007).</w:t>
       </w:r>
     </w:p>
     <w:p>
@@ -1663,7 +1646,7 @@
           <w:i w:val="0"/>
           <w:sz w:val="24"/>
         </w:rPr>
-        <w:t>Data collection was conducted over a two-day window (1–2 March 2026) using a systematic protocol designed to minimise algorithmic bias and ensure reproducibility. All searches were performed in logged-out, incognito (private) browsing mode in Google Chrome to eliminate the influence of personalised search algorithms, browsing history, and account-based recommendations on result rankings (Tripodi, 2018). The browser’s language was set to English (United States) and geolocation was configured to Kaunas, Lithuania, the researcher’s institutional location, to standardise the search environment across all platforms. No VPN was used.</w:t>
+        <w:t>Data collection was conducted over a two-day window (1â€“2 March 2026) using a systematic protocol designed to minimise algorithmic bias and ensure reproducibility. All searches were performed in logged-out, incognito (private) browsing mode in Google Chrome to eliminate the influence of personalised search algorithms, browsing history, and account-based recommendations on result rankings (Tripodi, 2018). The browserâ€™s language was set to English (United States) and geolocation was configured to Kaunas, Lithuania, the researcherâ€™s institutional location, to standardise the search environment across all platforms. No VPN was used.</w:t>
       </w:r>
     </w:p>
     <w:p>
@@ -1680,7 +1663,7 @@
           <w:i w:val="0"/>
           <w:sz w:val="24"/>
         </w:rPr>
-        <w:t>For traditional websites, searches were conducted on Google (google.com) using the default ‘All’ results tab; sponsored results and advertisements were excluded. For YouTube, searches were conducted on youtube.com using the default ‘Relevance’ sort. For both platforms, an automated data collection approach was employed using Playwright, an open-source browser automation framework. The automated scripts navigated to each platform, entered the standardised search terms, and systematically recorded the top 10 organic results for each query. This approach ensured consistency in result capture and eliminated human error in the recording of search rankings, URLs, and metadata. For TikTok and Instagram, manual data collection was conducted due to these platforms’ implementation of anti-bot measures that prevent reliable browser automation. TikTok searches used the in-app ‘Top’ tab; Instagram searches used the ‘Tags’ and ‘Top’ tabs. The primary researcher manually searched each term within the platform’s native search function, recording the first 10 relevant results in order of appearance. Reposts, advertisements, pinned/promoted content, and duplicate items from the same creator for the same search term were excluded and replaced by the next sequential organic result.</w:t>
+        <w:t>For traditional websites, searches were conducted on Google (google.com) using the default â€˜Allâ€™ results tab; sponsored results and advertisements were excluded. For YouTube, searches were conducted on youtube.com using the default â€˜Relevanceâ€™ sort. For both platforms, an automated data collection approach was employed using Playwright, an open-source browser automation framework. The automated scripts navigated to each platform, entered the standardised search terms, and systematically recorded the top 10 organic results for each query. This approach ensured consistency in result capture and eliminated human error in the recording of search rankings, URLs, and metadata. For TikTok and Instagram, manual data collection was conducted due to these platformsâ€™ implementation of anti-bot measures that prevent reliable browser automation. TikTok searches used the in-app â€˜Topâ€™ tab; Instagram searches used the â€˜Tagsâ€™ and â€˜Topâ€™ tabs. The primary researcher manually searched each term within the platformâ€™s native search function, recording the first 10 relevant results in order of appearance. Reposts, advertisements, pinned/promoted content, and duplicate items from the same creator for the same search term were excluded and replaced by the next sequential organic result.</w:t>
       </w:r>
     </w:p>
     <w:p>
@@ -1740,7 +1723,7 @@
           <w:i w:val="0"/>
           <w:sz w:val="24"/>
         </w:rPr>
-        <w:t>The DISCERN instrument (Charnock et al., 1999) is a validated and widely used tool for assessing the quality of written consumer health information. The instrument comprises 16 items, each scored on a Likert-type scale ranging from 1 (definite no) to 5 (definite yes). The instrument is divided into three sections: Section 1 (Questions 1–8) evaluates the reliability of the publication, addressing whether the content has clear aims, achieves those aims, is relevant, identifies its sources, is balanced, and provides sufficient detail for decision-making. Section 2 (Questions 9–15) assesses the quality of information about treatment choices, including descriptions of how treatments work, their benefits, risks, effects on quality of life, and what would happen without treatment. Section 3 comprises a single item (Question 16) providing an overall quality rating. Total scores range from 16 to 80.</w:t>
+        <w:t>The DISCERN instrument (Charnock et al., 1999) is a validated and widely used tool for assessing the quality of written consumer health information. The instrument comprises 16 items, each scored on a Likert-type scale ranging from 1 (definite no) to 5 (definite yes). The instrument is divided into three sections: Section 1 (Questions 1â€“8) evaluates the reliability of the publication, addressing whether the content has clear aims, achieves those aims, is relevant, identifies its sources, is balanced, and provides sufficient detail for decision-making. Section 2 (Questions 9â€“15) assesses the quality of information about treatment choices, including descriptions of how treatments work, their benefits, risks, effects on quality of life, and what would happen without treatment. Section 3 comprises a single item (Question 16) providing an overall quality rating. Total scores range from 16 to 80.</w:t>
       </w:r>
     </w:p>
     <w:p>
@@ -1757,7 +1740,7 @@
           <w:i w:val="0"/>
           <w:sz w:val="24"/>
         </w:rPr>
-        <w:t>For the purposes of the present study, DISCERN quality scores were categorised using the following established thresholds: Very Poor (16–26), Poor (27–38), Fair (39–50), Good (51–62), and Excellent (63–80). These categories facilitate meaningful interpretation and cross-study comparison of quality ratings. In adapting the instrument for social media content, questions pertaining to treatment information were interpreted in the context of exercise and physical activity recommendations, consistent with the approach adopted in prior studies examining fitness-related content (Kocyigit et al., 2019; Kong et al., 2021).</w:t>
+        <w:t>For the purposes of the present study, DISCERN quality scores were categorised using the following established thresholds: Very Poor (16â€“26), Poor (27â€“38), Fair (39â€“50), Good (51â€“62), and Excellent (63â€“80). These categories facilitate meaningful interpretation and cross-study comparison of quality ratings. In adapting the instrument for social media content, questions pertaining to treatment information were interpreted in the context of exercise and physical activity recommendations, consistent with the approach adopted in prior studies examining fitness-related content (Kocyigit et al., 2019; Kong et al., 2021).</w:t>
       </w:r>
     </w:p>
     <w:p>
@@ -3030,7 +3013,7 @@
           <w:i w:val="0"/>
           <w:sz w:val="20"/>
         </w:rPr>
-        <w:t>Adapted from “DISCERN: An instrument for judging the quality of written consumer health information on treatment choices,” by D. Charnock, S. Shepperd, G. Needham, and R. Gann, 1999, Journal of Epidemiology &amp; Community Health, 53(2), 105–111. Each item is scored from 1 (definite no) to 5 (definite yes). For social media content, treatment-related questions (Q9–Q15) were interpreted as referring to exercise and physical activity recommendations.</w:t>
+        <w:t>Adapted from â€œDISCERN: An instrument for judging the quality of written consumer health information on treatment choices,â€ by D. Charnock, S. Shepperd, G. Needham, and R. Gann, 1999, Journal of Epidemiology &amp; Community Health, 53(2), 105â€“111. Each item is scored from 1 (definite no) to 5 (definite yes). For social media content, treatment-related questions (Q9â€“Q15) were interpreted as referring to exercise and physical activity recommendations.</w:t>
       </w:r>
     </w:p>
     <w:p>
@@ -3057,7 +3040,7 @@
           <w:i w:val="0"/>
           <w:sz w:val="24"/>
         </w:rPr>
-        <w:t>The JAMA benchmarks (Silberg et al., 1997) provide a concise accountability framework for evaluating health information. The instrument assesses four criteria, each scored dichotomously as present (Y) or absent (N): (a) Authorship—whether authors and their credentials or affiliations are clearly identified; (b) Attribution—whether references and sources for content are cited; (c) Disclosure—whether sponsorship, advertising, conflicts of interest, or financial relationships are declared; and (d) Currency—whether the date of content creation or most recent update is provided. The total JAMA score ranges from 0 to 4, representing the number of criteria met.</w:t>
+        <w:t>The JAMA benchmarks (Silberg et al., 1997) provide a concise accountability framework for evaluating health information. The instrument assesses four criteria, each scored dichotomously as present (Y) or absent (N): (a) Authorshipâ€”whether authors and their credentials or affiliations are clearly identified; (b) Attributionâ€”whether references and sources for content are cited; (c) Disclosureâ€”whether sponsorship, advertising, conflicts of interest, or financial relationships are declared; and (d) Currencyâ€”whether the date of content creation or most recent update is provided. The total JAMA score ranges from 0 to 4, representing the number of criteria met.</w:t>
       </w:r>
     </w:p>
     <w:p>
@@ -3494,7 +3477,7 @@
           <w:i w:val="0"/>
           <w:sz w:val="20"/>
         </w:rPr>
-        <w:t>Adapted from “Assessing, controlling, and assuring the quality of medical information on the internet,” by W. M. Silberg, G. D. Lundberg, and R. A. Musacchio, 1997, JAMA, 277(15), 1244–1245. Each criterion is scored as present (Y) or absent (N). CSCS = Certified Strength and Conditioning Specialist; MD = Medical Doctor; PT = Physical Therapist.</w:t>
+        <w:t>Adapted from â€œAssessing, controlling, and assuring the quality of medical information on the internet,â€ by W. M. Silberg, G. D. Lundberg, and R. A. Musacchio, 1997, JAMA, 277(15), 1244â€“1245. Each criterion is scored as present (Y) or absent (N). CSCS = Certified Strength and Conditioning Specialist; MD = Medical Doctor; PT = Physical Therapist.</w:t>
       </w:r>
     </w:p>
     <w:p>
@@ -3685,7 +3668,7 @@
           <w:i w:val="0"/>
           <w:sz w:val="24"/>
         </w:rPr>
-        <w:t xml:space="preserve">Phase 2: Manual data collection (Days 1–2). </w:t>
+        <w:t xml:space="preserve">Phase 2: Manual data collection (Days 1â€“2). </w:t>
       </w:r>
       <w:r>
         <w:rPr>
@@ -3712,6 +3695,33 @@
           <w:i w:val="0"/>
           <w:sz w:val="24"/>
         </w:rPr>
+        <w:t xml:space="preserve">Pilot scoring. </w:t>
+      </w:r>
+      <w:r>
+        <w:rPr>
+          <w:rFonts w:ascii="Times New Roman" w:hAnsi="Times New Roman" w:cs="Times New Roman"/>
+          <w:rFonts w:ascii="Times New Roman" w:hAnsi="Times New Roman"/>
+          <w:b w:val="0"/>
+          <w:i w:val="0"/>
+          <w:sz w:val="24"/>
+        </w:rPr>
+        <w:t>Prior to the full assessment, the primary researcher conducted a pilot scoring exercise on 10 content items (2â€“3 per platform, not included in the final sample) to test the operationalisation of the DISCERN and JAMA instruments for social media content. This pilot identified that DISCERN questions Q4 (sources of information) and Q11 (risks of treatment) were the most challenging to adapt to short-form video, as these items often required inference from visual and verbal cues rather than explicit textual statements. Scoring rules were refined accordingly: for Q4, on-screen citation of sources or verbal references to guidelines were accepted; for Q11, any mention of injury risk, contraindications, or the advice to consult a professional was scored positively. These pilot-derived rules were documented in the scoring guide and applied consistently across the final 197-item sample.</w:t>
+      </w:r>
+    </w:p>
+    <w:p>
+      <w:pPr>
+        <w:spacing w:before="0" w:after="120" w:line="360" w:lineRule="auto"/>
+        <w:ind w:firstLine="720"/>
+        <w:jc w:val="both"/>
+      </w:pPr>
+      <w:r>
+        <w:rPr>
+          <w:rFonts w:ascii="Times New Roman" w:hAnsi="Times New Roman" w:cs="Times New Roman"/>
+          <w:rFonts w:ascii="Times New Roman" w:hAnsi="Times New Roman"/>
+          <w:b/>
+          <w:i w:val="0"/>
+          <w:sz w:val="24"/>
+        </w:rPr>
         <w:t xml:space="preserve">Phase 3: Primary quality assessment. </w:t>
       </w:r>
       <w:r>
@@ -3722,7 +3732,7 @@
           <w:i w:val="0"/>
           <w:sz w:val="24"/>
         </w:rPr>
-        <w:t>The primary researcher assessed all 200 content items using both the DISCERN instrument and the JAMA benchmarks. For text-based website content, each article was read in full. For video content (YouTube and TikTok), scoring was based on a combination of the video content itself, visible captions, descriptions, and on-screen text; full verbatim transcription was not performed. For Instagram carousels and image posts, scoring was based on all visible text, captions, and associated profile information. This approach reflects the information a typical user would encounter when engaging with each item. Scores were recorded in a structured data collection spreadsheet.</w:t>
+        <w:t>The primary researcher assessed all 197 content items using both the DISCERN instrument and the JAMA benchmarks. For text-based website content, each article was read in full. For video content (YouTube and TikTok), scoring was based on a combination of the video content itself, visible captions, descriptions, and on-screen text; full verbatim transcription was not performed. For Instagram carousels and image posts, scoring was based on all visible text, captions, and associated profile information. This approach reflects the information a typical user would encounter when engaging with each item. Scores were recorded in a structured data collection spreadsheet.</w:t>
       </w:r>
     </w:p>
     <w:p>
@@ -3749,7 +3759,7 @@
           <w:i w:val="0"/>
           <w:sz w:val="24"/>
         </w:rPr>
-        <w:t>A trained second rater independently scored a 20% subsample of content items (n = 40; 10 randomly selected items per platform) using both instruments. The second rater was provided with the same scoring guidelines and training materials as the primary researcher to ensure standardised application of the assessment criteria.</w:t>
+        <w:t>A trained second raterâ€”a fellow Master of Public Health student with prior coursework in epidemiology and health communicationâ€”independently scored a 20% subsample of content items (n = 40; 10 randomly selected items per platform) using both instruments. Prior to independent scoring, the second rater received a two-hour training session covering the DISCERN instrument, JAMA benchmarks, and their social media operationalisations, followed by supervised practice scoring of five items (not included in the final sample) with discussion of discrepancies. The second rater was then provided with the same scoring guidelines, quick-reference card, and worked examples as the primary researcher to ensure standardised application of the assessment criteria.</w:t>
       </w:r>
     </w:p>
     <w:p>
@@ -3776,7 +3786,7 @@
           <w:i w:val="0"/>
           <w:sz w:val="24"/>
         </w:rPr>
-        <w:t>Agreement between the primary researcher and the second rater was evaluated using the Intraclass Correlation Coefficient (ICC) for DISCERN scores and Cohen’s kappa (κ) for JAMA criteria. These metrics are reported in the Results chapter.</w:t>
+        <w:t>Agreement between the primary researcher and the second rater was evaluated using the Intraclass Correlation Coefficient (ICC) for DISCERN scores and Cohenâ€™s kappa (Îº) for JAMA criteria. These metrics are reported in the Results chapter.</w:t>
       </w:r>
     </w:p>
     <w:p>
@@ -3888,7 +3898,7 @@
               </w:rPr>
               <w:t>Phase 1: Automated Data Collection</w:t>
               <w:br/>
-              <w:t>(Google &amp; YouTube via Playwright – Day 1)</w:t>
+              <w:t>(Google &amp; YouTube via Playwright â€“ Day 1)</w:t>
             </w:r>
           </w:p>
         </w:tc>
@@ -3917,7 +3927,7 @@
                 <w:i w:val="0"/>
                 <w:sz w:val="28"/>
               </w:rPr>
-              <w:t>↓</w:t>
+              <w:t>â†“</w:t>
             </w:r>
           </w:p>
         </w:tc>
@@ -3948,7 +3958,7 @@
               </w:rPr>
               <w:t>Phase 2: Manual Data Collection</w:t>
               <w:br/>
-              <w:t>(TikTok &amp; Instagram – Days 1–2)</w:t>
+              <w:t>(TikTok &amp; Instagram â€“ Days 1â€“2)</w:t>
             </w:r>
           </w:p>
         </w:tc>
@@ -3977,7 +3987,7 @@
                 <w:i w:val="0"/>
                 <w:sz w:val="28"/>
               </w:rPr>
-              <w:t>↓</w:t>
+              <w:t>â†“</w:t>
             </w:r>
           </w:p>
         </w:tc>
@@ -4037,7 +4047,7 @@
                 <w:i w:val="0"/>
                 <w:sz w:val="28"/>
               </w:rPr>
-              <w:t>↓</w:t>
+              <w:t>â†“</w:t>
             </w:r>
           </w:p>
         </w:tc>
@@ -4097,7 +4107,7 @@
                 <w:i w:val="0"/>
                 <w:sz w:val="28"/>
               </w:rPr>
-              <w:t>↓</w:t>
+              <w:t>â†“</w:t>
             </w:r>
           </w:p>
         </w:tc>
@@ -4128,7 +4138,7 @@
               </w:rPr>
               <w:t>Phase 5: Inter-Rater Reliability</w:t>
               <w:br/>
-              <w:t>(ICC for DISCERN; Cohen’s κ for JAMA)</w:t>
+              <w:t>(ICC for DISCERN; Cohenâ€™s Îº for JAMA)</w:t>
             </w:r>
           </w:p>
         </w:tc>
@@ -4157,7 +4167,7 @@
                 <w:i w:val="0"/>
                 <w:sz w:val="28"/>
               </w:rPr>
-              <w:t>↓</w:t>
+              <w:t>â†“</w:t>
             </w:r>
           </w:p>
         </w:tc>
@@ -4217,7 +4227,7 @@
           <w:i w:val="0"/>
           <w:sz w:val="20"/>
         </w:rPr>
-        <w:t>The research process proceeded sequentially through six phases over the study period (February–March 2026).</w:t>
+        <w:t>The research process proceeded sequentially through six phases over the study period (Februaryâ€“March 2026).</w:t>
       </w:r>
     </w:p>
     <w:p>
@@ -4283,7 +4293,7 @@
           <w:i w:val="0"/>
           <w:sz w:val="24"/>
         </w:rPr>
-        <w:t>All statistical analyses were conducted using Python 3.13 with the following scientific computing libraries: pandas (McKinney, 2010) for data manipulation, SciPy (Virtanen et al., 2020) for non-parametric inferential tests including Kruskal–Wallis, Mann–Whitney U, chi-square, and Spearman correlations, scikit-posthocs (Terpilowski, 2019) for Dunn’s post-hoc comparisons with Bonferroni correction, pingouin (Vallat, 2018) for intraclass correlation coefficient computation, and matplotlib/seaborn for publication-quality graphical representations. The significance level was set at α = 0.05 for all inferential tests. The complete analysis code is reproduced in Appendix D.</w:t>
+        <w:t>All statistical analyses were conducted using Python 3.13 with the following scientific computing libraries: pandas (McKinney, 2010) for data manipulation, SciPy (Virtanen et al., 2020) for non-parametric inferential tests including Kruskalâ€“Wallis, Mannâ€“Whitney U, chi-square, and Spearman correlations, scikit-posthocs (Terpilowski, 2019) for Dunnâ€™s post-hoc comparisons with Bonferroni correction, pingouin (Vallat, 2018) for intraclass correlation coefficient computation, and matplotlib/seaborn for publication-quality graphical representations. The significance level was set at Î± = 0.05 for all inferential tests. The complete analysis code is reproduced in Appendix D.</w:t>
       </w:r>
     </w:p>
     <w:p>
@@ -4349,7 +4359,7 @@
           <w:i w:val="0"/>
           <w:sz w:val="24"/>
         </w:rPr>
-        <w:t>Inter-rater reliability was assessed for the 20% subsample (n = 40) independently scored by both the primary researcher and the second rater. For DISCERN total scores, the Intraclass Correlation Coefficient (ICC) was calculated using a two-way mixed-effects model, single measures, with absolute agreement (ICC[3,1]; Koo &amp; Li, 2016). ICC values were interpreted according to established guidelines: values less than 0.50 indicate poor reliability, 0.50–0.75 indicate moderate reliability, 0.75–0.90 indicate good reliability, and values greater than 0.90 indicate excellent reliability (Koo &amp; Li, 2016).</w:t>
+        <w:t>Inter-rater reliability was assessed for the 20% subsample (n = 40) independently scored by both the primary researcher and the second rater. For DISCERN total scores, the Intraclass Correlation Coefficient (ICC) was calculated using a two-way mixed-effects model, single measures, with absolute agreement (ICC[3,1]; Koo &amp; Li, 2016). ICC values were interpreted according to established guidelines: values less than 0.50 indicate poor reliability, 0.50â€“0.75 indicate moderate reliability, 0.75â€“0.90 indicate good reliability, and values greater than 0.90 indicate excellent reliability (Koo &amp; Li, 2016).</w:t>
       </w:r>
     </w:p>
     <w:p>
@@ -4366,7 +4376,7 @@
           <w:i w:val="0"/>
           <w:sz w:val="24"/>
         </w:rPr>
-        <w:t>For the JAMA benchmark criteria, which are scored dichotomously (present/absent), Cohen’s kappa (κ) was calculated for each criterion. Kappa values were interpreted using the guidelines proposed by Landis and Koch (1977): values below 0.20 indicate slight agreement, 0.21–0.40 indicate fair agreement, 0.41–0.60 indicate moderate agreement, 0.61–0.80 indicate substantial agreement, and values above 0.80 indicate almost perfect agreement.</w:t>
+        <w:t>For the JAMA benchmark criteria, which are scored dichotomously (present/absent), Cohenâ€™s kappa (Îº) was calculated for each criterion. Kappa values were interpreted using the guidelines proposed by Landis and Koch (1977): values below 0.20 indicate slight agreement, 0.21â€“0.40 indicate fair agreement, 0.41â€“0.60 indicate moderate agreement, 0.61â€“0.80 indicate substantial agreement, and values above 0.80 indicate almost perfect agreement.</w:t>
       </w:r>
     </w:p>
     <w:p>
@@ -4426,7 +4436,7 @@
           <w:i w:val="0"/>
           <w:sz w:val="24"/>
         </w:rPr>
-        <w:t>The Kruskal-Wallis H test was employed to examine whether DISCERN total scores differed significantly across the four platforms (Google, YouTube, TikTok, and Instagram). When a statistically significant omnibus result was obtained, Dunn’s post-hoc test with Bonferroni correction was applied to identify which specific platform pairs differed significantly. The effect size was quantified using eta-squared (η²), computed as η² = (H − k + 1) / (N − k), where H is the Kruskal-Wallis statistic, k the number of groups, and N the total sample size. This is an approximation rather than a true proportion of variance explained and should be interpreted accordingly; values of approximately 0.01, 0.06, and 0.14 correspond to small, medium, and large effects, respectively (Cohen, 1988).</w:t>
+        <w:t>The Kruskal-Wallis H test was employed to examine whether DISCERN total scores differed significantly across the four platforms (Google, YouTube, TikTok, and Instagram). When a statistically significant omnibus result was obtained, Dunnâ€™s post-hoc test with Bonferroni correction was applied to identify which specific platform pairs differed significantly. The effect size was quantified using eta-squared (Î·Â²), computed as Î·Â² = (H âˆ’ k + 1) / (N âˆ’ k), where H is the Kruskal-Wallis statistic, k the number of groups, and N the total sample size. This is an approximation rather than a true proportion of variance explained and should be interpreted accordingly; values of approximately 0.01, 0.06, and 0.14 correspond to small, medium, and large effects, respectively (Cohen, 1988).</w:t>
       </w:r>
     </w:p>
     <w:p>
@@ -4453,7 +4463,7 @@
           <w:i w:val="0"/>
           <w:sz w:val="24"/>
         </w:rPr>
-        <w:t>The chi-square test of independence was used to assess whether the proportion of content meeting each JAMA criterion differed across platforms. Where expected cell frequencies fell below 5, Fisher’s exact test was employed as an alternative. The effect size was reported as Cramér’s V, interpreted according to Cohen’s (1988) guidelines: values of 0.10, 0.30, and 0.50 represent small, medium, and large effects for tables with three degrees of freedom.</w:t>
+        <w:t>The chi-square test of independence was used to assess whether the proportion of content meeting each JAMA criterion differed across platforms. Where expected cell frequencies fell below 5, Fisherâ€™s exact test was employed as an alternative. The effect size was reported as CramÃ©râ€™s V, interpreted according to Cohenâ€™s (1988) guidelines: values of 0.10, 0.30, and 0.50 represent small, medium, and large effects for tables with three degrees of freedom.</w:t>
       </w:r>
     </w:p>
     <w:p>
@@ -4480,7 +4490,7 @@
           <w:i w:val="0"/>
           <w:sz w:val="24"/>
         </w:rPr>
-        <w:t>To investigate whether creator type moderates information quality, DISCERN scores were compared between professional creators (healthcare professionals and certified fitness professionals combined) and non-professional creators (fitness influencers, general users, and organisations combined) using the Mann-Whitney U test. Organisations were classified as non-professional because they encompass a heterogeneous mix of entities—from government health departments to commercial fitness brands—making uniform professional classification inappropriate. The effect size was reported as rank-biserial correlation (r</w:t>
+        <w:t>To investigate whether creator type moderates information quality, DISCERN scores were compared between professional creators (healthcare professionals and certified fitness professionals combined) and non-professional creators (fitness influencers, general users, and organisations combined) using the Mann-Whitney U test. Organisations were classified as non-professional because they encompass a heterogeneous mix of entitiesâ€”from government health departments to commercial fitness brandsâ€”making uniform professional classification inappropriate. The effect size was reported as rank-biserial correlation (r</w:t>
       </w:r>
       <w:r>
         <w:rPr>
@@ -4527,7 +4537,7 @@
           <w:i w:val="0"/>
           <w:sz w:val="24"/>
         </w:rPr>
-        <w:t>Spearman’s rank correlation coefficient (ρ) was calculated to examine the relationship between engagement metrics (views, likes, shares) and DISCERN total scores. This non-parametric correlation was selected due to the highly skewed distribution typically observed in engagement data and the ordinal nature of DISCERN scores. Correlation strength was interpreted as: ρ &lt; 0.10 negligible, 0.10–0.39 weak, 0.40–0.69 moderate, and ≥ 0.70 strong (Schober et al., 2018).</w:t>
+        <w:t>Spearmanâ€™s rank correlation coefficient (Ï) was calculated to examine the relationship between engagement metrics (views, likes, shares) and DISCERN total scores. This non-parametric correlation was selected due to the highly skewed distribution typically observed in engagement data and the ordinal nature of DISCERN scores. Correlation strength was interpreted as: Ï &lt; 0.10 negligible, 0.10â€“0.39 weak, 0.40â€“0.69 moderate, and â‰¥ 0.70 strong (Schober et al., 2018).</w:t>
       </w:r>
     </w:p>
     <w:p>
@@ -4760,11 +4770,11 @@
               </w:rPr>
               <w:t>Kruskal-Wallis H test (DISCERN)</w:t>
               <w:br/>
-              <w:t>Dunn’s post-hoc with Bonferroni</w:t>
+              <w:t>Dunnâ€™s post-hoc with Bonferroni</w:t>
               <w:br/>
-              <w:t>χ² / Fisher’s exact test (JAMA)</w:t>
+              <w:t>Ï‡Â² / Fisherâ€™s exact test (JAMA)</w:t>
               <w:br/>
-              <w:t>Effect sizes: η², Cramér’s V</w:t>
+              <w:t>Effect sizes: Î·Â², CramÃ©râ€™s V</w:t>
             </w:r>
           </w:p>
         </w:tc>
@@ -4950,7 +4960,7 @@
                 <w:i w:val="0"/>
                 <w:sz w:val="18"/>
               </w:rPr>
-              <w:t>Spearman’s rank correlation (ρ)</w:t>
+              <w:t>Spearmanâ€™s rank correlation (Ï)</w:t>
             </w:r>
           </w:p>
         </w:tc>
@@ -5044,7 +5054,7 @@
               </w:rPr>
               <w:t>ICC (two-way mixed, single measures, absolute agreement) for DISCERN</w:t>
               <w:br/>
-              <w:t>Cohen’s κ for each JAMA criterion</w:t>
+              <w:t>Cohenâ€™s Îº for each JAMA criterion</w:t>
             </w:r>
           </w:p>
         </w:tc>
@@ -5066,7 +5076,7 @@
                 <w:i w:val="0"/>
                 <w:sz w:val="18"/>
               </w:rPr>
-              <w:t>ICC suitable for continuous/ordinal data; κ appropriate for dichotomous categorical data.</w:t>
+              <w:t>ICC suitable for continuous/ordinal data; Îº appropriate for dichotomous categorical data.</w:t>
             </w:r>
           </w:p>
         </w:tc>
@@ -5094,7 +5104,7 @@
           <w:i w:val="0"/>
           <w:sz w:val="20"/>
         </w:rPr>
-        <w:t>IV = independent variable; DV = dependent variable; PA = physical activity; ICC = Intraclass Correlation Coefficient; η² = eta-squared (approximation); χ² = chi-square; κ = kappa; ρ = Spearman’s rho. Significance level: α = 0.05 for all tests.</w:t>
+        <w:t>IV = independent variable; DV = dependent variable; PA = physical activity; ICC = Intraclass Correlation Coefficient; Î·Â² = eta-squared (approximation); Ï‡Â² = chi-square; Îº = kappa; Ï = Spearmanâ€™s rho. Significance level: Î± = 0.05 for all tests.</w:t>
       </w:r>
     </w:p>
     <w:p>

</xml_diff>

<commit_message>
fix thesis toc and chapter 4 heading
</commit_message>
<xml_diff>
--- a/chapters/chapter2_methodology.docx
+++ b/chapters/chapter2_methodology.docx
@@ -4,6 +4,7 @@
   <w:body>
     <w:p>
       <w:pPr>
+        <w:pStyle w:val="Heading1"/>
         <w:spacing w:before="0" w:after="240" w:line="360" w:lineRule="auto"/>
         <w:jc w:val="center"/>
       </w:pPr>
@@ -37,6 +38,7 @@
     </w:p>
     <w:p>
       <w:pPr>
+        <w:pStyle w:val="Heading2"/>
         <w:spacing w:before="240" w:after="120" w:line="360" w:lineRule="auto"/>
         <w:jc w:val="left"/>
       </w:pPr>
@@ -87,6 +89,7 @@
     </w:p>
     <w:p>
       <w:pPr>
+        <w:pStyle w:val="Heading2"/>
         <w:spacing w:before="240" w:after="120" w:line="360" w:lineRule="auto"/>
         <w:jc w:val="left"/>
       </w:pPr>
@@ -289,6 +292,7 @@
     </w:p>
     <w:p>
       <w:pPr>
+        <w:pStyle w:val="Heading2"/>
         <w:spacing w:before="240" w:after="120" w:line="360" w:lineRule="auto"/>
         <w:jc w:val="left"/>
       </w:pPr>
@@ -339,6 +343,7 @@
     </w:p>
     <w:p>
       <w:pPr>
+        <w:pStyle w:val="Heading2"/>
         <w:spacing w:before="240" w:after="120" w:line="360" w:lineRule="auto"/>
         <w:jc w:val="left"/>
       </w:pPr>
@@ -1602,6 +1607,7 @@
     </w:p>
     <w:p>
       <w:pPr>
+        <w:pStyle w:val="Heading2"/>
         <w:spacing w:before="240" w:after="120" w:line="360" w:lineRule="auto"/>
         <w:jc w:val="left"/>
       </w:pPr>
@@ -3596,6 +3602,7 @@
     </w:p>
     <w:p>
       <w:pPr>
+        <w:pStyle w:val="Heading2"/>
         <w:spacing w:before="240" w:after="120" w:line="360" w:lineRule="auto"/>
         <w:jc w:val="left"/>
       </w:pPr>
@@ -4265,6 +4272,7 @@
     </w:p>
     <w:p>
       <w:pPr>
+        <w:pStyle w:val="Heading2"/>
         <w:spacing w:before="240" w:after="120" w:line="360" w:lineRule="auto"/>
         <w:jc w:val="left"/>
       </w:pPr>

</xml_diff>

<commit_message>
finalize thesis audit consistency fixes
</commit_message>
<xml_diff>
--- a/chapters/chapter2_methodology.docx
+++ b/chapters/chapter2_methodology.docx
@@ -135,7 +135,7 @@
           <w:i w:val="0"/>
           <w:sz w:val="24"/>
         </w:rPr>
-        <w:t>The research follows a deductive approach, applying established quality assessment frameworks—the DISCERN instrument and JAMA benchmarks—to evaluate content across a novel four-platform comparison. While these instruments were originally developed for traditional health information materials, their application to social media content represents a theoretically grounded extension that has been validated in prior research examining YouTube (Azer, 2020), TikTok (Kong et al., 2021), and Instagram health content (Chea &amp; Lim, 2023).</w:t>
+        <w:t>The research follows a deductive approach, applying established quality assessment frameworks—the DISCERN instrument and JAMA benchmarks—to evaluate content across a novel four-platform comparison. While these instruments were originally developed for traditional health information materials, they are widely used in studies of YouTube, TikTok, and Instagram health content despite recognised methodological concerns when applied to audiovisual and short-form media (Azer, 2020; Kong et al., 2021; Chea &amp; Lim, 2023). The present study therefore treats their use as a transparent, controlled adaptation rather than as a platform-specific validation.</w:t>
       </w:r>
     </w:p>
     <w:p>
@@ -406,6 +406,23 @@
           <w:i w:val="0"/>
           <w:sz w:val="24"/>
         </w:rPr>
+        <w:t>Verification required a raw screenshot or captured record showing the content identifier or URL together with the metadata fields used in analysis (for example, platform, creator, date, content format, or engagement counts). Records that could not be matched to this audit evidence were removed from the final audited dataset.</w:t>
+      </w:r>
+    </w:p>
+    <w:p>
+      <w:pPr>
+        <w:spacing w:before="0" w:after="120" w:line="360" w:lineRule="auto"/>
+        <w:ind w:firstLine="720"/>
+        <w:jc w:val="both"/>
+      </w:pPr>
+      <w:r>
+        <w:rPr>
+          <w:rFonts w:ascii="Times New Roman" w:hAnsi="Times New Roman" w:cs="Times New Roman"/>
+          <w:rFonts w:ascii="Times New Roman" w:hAnsi="Times New Roman"/>
+          <w:b w:val="0"/>
+          <w:i w:val="0"/>
+          <w:sz w:val="24"/>
+        </w:rPr>
         <w:t>Content was retrieved using five standardised search terms designed to simulate typical user queries related to physical activity:</w:t>
       </w:r>
     </w:p>
@@ -579,7 +596,7 @@
           <w:i w:val="0"/>
           <w:sz w:val="24"/>
         </w:rPr>
-        <w:t>Accordingly, Table 2.1 should be interpreted as the planned sampling matrix rather than the final audited analytical distribution. All inferential analyses reported in Chapters 3–5 and the appendices are based on the final audited dataset of 197 items.</w:t>
+        <w:t>Accordingly, Table 2.1 should be interpreted as the planned sampling matrix rather than the final audited analytical distribution. All inferential analyses reported in Chapters 3–4, the concluding sections, and the appendices are based on the final audited dataset of 197 items.</w:t>
       </w:r>
     </w:p>
     <w:p>
@@ -1782,7 +1799,7 @@
           <w:i w:val="0"/>
           <w:sz w:val="24"/>
         </w:rPr>
-        <w:t>For the purposes of the present study, DISCERN quality scores were categorised using the following established thresholds: Very Poor (16–26), Poor (27–38), Fair (39–50), Good (51–62), and Excellent (63–80). These categories facilitate meaningful interpretation and cross-study comparison of quality ratings. In adapting the instrument for social media content, questions pertaining to treatment information were interpreted in the context of exercise and physical activity recommendations, consistent with the approach adopted in prior studies examining fitness-related content (Kocyigit et al., 2019; Kong et al., 2021).</w:t>
+        <w:t>For the purposes of the present study, DISCERN quality scores were categorised using the following established thresholds: Very Poor (16–26), Poor (27–38), Fair (39–50), Good (51–62), and Excellent (63–80). These conventional categories facilitate meaningful interpretation and cross-study comparison of quality ratings (Sun et al., 2023). In adapting the instrument for social media content, questions pertaining to treatment information were interpreted in the context of exercise and physical activity recommendations, consistent with the approach adopted in prior studies examining fitness-related content (Kocyigit et al., 2019; Kong et al., 2021).</w:t>
       </w:r>
     </w:p>
     <w:p>
@@ -4502,7 +4519,7 @@
           <w:i w:val="0"/>
           <w:sz w:val="24"/>
         </w:rPr>
-        <w:t>The Kruskal-Wallis H test was employed to examine whether DISCERN total scores differed significantly across the four platforms (websites, YouTube, TikTok, and Instagram). When a statistically significant omnibus result was obtained, pairwise Mann–Whitney U tests with Bonferroni correction were applied to identify which specific platform pairs differed significantly. The omnibus effect size was computed using the formula (H − k + 1) / (N − k) and is reported as a rank-based effect-size estimate to avoid terminological ambiguity. This value should be interpreted cautiously as an index of distributional separation rather than a literal proportion of explained variance; values of approximately 0.01, 0.06, and 0.14 correspond to small, medium, and large effects, respectively (Cohen, 1988).</w:t>
+        <w:t>The Kruskal-Wallis H test was employed to examine whether DISCERN total scores differed significantly across the four platforms (websites, YouTube, TikTok, and Instagram). When a statistically significant omnibus result was obtained, pairwise Mann–Whitney U tests with Bonferroni correction were applied to identify which specific platform pairs differed significantly. The omnibus effect size was computed using the formula (H − k + 1) / (N − k) and is reported as an eta-squared approximation for Kruskal-Wallis comparisons. This value should be interpreted cautiously as an index of distributional separation rather than a literal proportion of explained variance; values of approximately 0.01, 0.06, and 0.14 correspond to small, medium, and large effects, respectively (Cohen, 1988).</w:t>
       </w:r>
     </w:p>
     <w:p>
@@ -4840,7 +4857,7 @@
               <w:br/>
               <w:t>χ² / Fisher’s exact test (JAMA)</w:t>
               <w:br/>
-              <w:t>Effect sizes: rank-based H effect, Cramér’s V</w:t>
+              <w:t>Effect sizes: eta-squared approximation, Cramér’s V</w:t>
             </w:r>
           </w:p>
         </w:tc>

</xml_diff>

<commit_message>
replace unverified references with verified sources
</commit_message>
<xml_diff>
--- a/chapters/chapter2_methodology.docx
+++ b/chapters/chapter2_methodology.docx
@@ -135,7 +135,7 @@
           <w:i w:val="0"/>
           <w:sz w:val="24"/>
         </w:rPr>
-        <w:t>The research follows a deductive approach, applying established quality assessment frameworks—the DISCERN instrument and JAMA benchmarks—to evaluate content across a novel four-platform comparison. While these instruments were originally developed for traditional health information materials, they are widely used in studies of YouTube, TikTok, and Instagram health content despite recognised methodological concerns when applied to audiovisual and short-form media (Azer, 2020; Kong et al., 2021; Chea &amp; Lim, 2023). The present study therefore treats their use as a transparent, controlled adaptation rather than as a platform-specific validation.</w:t>
+        <w:t>The research follows a deductive approach, applying established quality assessment frameworks—the DISCERN instrument and JAMA benchmarks—to evaluate content across a novel four-platform comparison. While these instruments were originally developed for traditional health information materials, they are widely used in studies of YouTube and TikTok health content despite recognised methodological concerns when applied to audiovisual and short-form media (Azer, 2020; Kong et al., 2021; Li et al., 2024). The present study therefore treats their use as a transparent, controlled adaptation rather than as a platform-specific validation.</w:t>
       </w:r>
     </w:p>
     <w:p>
@@ -389,7 +389,7 @@
           <w:i w:val="0"/>
           <w:sz w:val="24"/>
         </w:rPr>
-        <w:t>The sampling design targeted 200 content items from four digital platforms: traditional websites accessed through Google search (target n = 50), YouTube (target n = 50), TikTok (target n = 50), and Instagram (target n = 50). This target sample size was determined based on precedent in health information quality research, where samples of 40–60 items per platform have been established as sufficient for detecting meaningful quality differences (Leong et al., 2021; Drozd et al., 2018). Following the post-collection audit, three TikTok records could not be verified against the raw captures and were excluded without replacement, yielding a final analytical sample of 197 items (50 websites, 50 YouTube videos, 47 TikTok videos, and 50 Instagram posts).</w:t>
+        <w:t>The sampling design targeted 200 content items from four digital platforms: traditional websites accessed through Google search (target n = 50), YouTube (target n = 50), TikTok (target n = 50), and Instagram (target n = 50). This target sample size was designed to provide balanced cross-platform coverage and is comparable to sample sizes commonly used in online health-information quality studies summarised in prior reviews (Drozd et al., 2018; Osman et al., 2022). Following the post-collection audit, three TikTok records could not be verified against the raw captures and were excluded without replacement, yielding a final analytical sample of 197 items (50 websites, 50 YouTube videos, 47 TikTok videos, and 50 Instagram posts).</w:t>
       </w:r>
     </w:p>
     <w:p>
@@ -3133,7 +3133,7 @@
           <w:i w:val="0"/>
           <w:sz w:val="24"/>
         </w:rPr>
-        <w:t>To apply the JAMA benchmarks to social media content, which differs substantially in format from traditional web-based health information, the criteria were operationalised as described in Table 2.3. This operationalisation draws on adaptations employed in prior research assessing social media health content (Delli et al., 2016; Kocyigit et al., 2019).</w:t>
+        <w:t>To apply the JAMA benchmarks to social media content, which differs substantially in format from traditional web-based health information, the criteria were operationalised as described in Table 2.3. This operationalisation draws on adaptations employed in prior research assessing YouTube health content (Drozd et al., 2018; Kocyigit et al., 2019).</w:t>
       </w:r>
     </w:p>
     <w:p>
@@ -4492,7 +4492,7 @@
           <w:i w:val="0"/>
           <w:sz w:val="24"/>
         </w:rPr>
-        <w:t>Non-parametric statistical tests were selected as the primary inferential methods due to the ordinal nature of DISCERN scores and the anticipated non-normal distribution of quality data, consistent with methodological recommendations for health information quality research (Naaman et al., 2022).</w:t>
+        <w:t>Non-parametric statistical tests were selected as the primary inferential methods due to the ordinal nature of DISCERN scores and the anticipated non-normal distribution of quality data, consistent with methodological recommendations for analysing Likert-type rating scales (Sullivan &amp; Artino, 2013).</w:t>
       </w:r>
     </w:p>
     <w:p>

</xml_diff>